<commit_message>
Update report references to renamed code directory
</commit_message>
<xml_diff>
--- a/Fake_Job_Detection_Report.docx
+++ b/Fake_Job_Detection_Report.docx
@@ -5761,7 +5761,7 @@
                 <w:rFonts w:ascii="STSong" w:hAnsi="STSong" w:eastAsia="STSong"/>
                 <w:sz w:val="18"/>
               </w:rPr>
-              <w:t>src/train.py</w:t>
+              <w:t>code/train.py</w:t>
             </w:r>
           </w:p>
         </w:tc>
@@ -5828,7 +5828,7 @@
                 <w:rFonts w:ascii="STSong" w:hAnsi="STSong" w:eastAsia="STSong"/>
                 <w:sz w:val="18"/>
               </w:rPr>
-              <w:t>src/predict.py</w:t>
+              <w:t>code/predict.py</w:t>
             </w:r>
           </w:p>
         </w:tc>
@@ -5895,7 +5895,7 @@
                 <w:rFonts w:ascii="STSong" w:hAnsi="STSong" w:eastAsia="STSong"/>
                 <w:sz w:val="18"/>
               </w:rPr>
-              <w:t>src/train_advanced.py</w:t>
+              <w:t>code/train_advanced.py</w:t>
             </w:r>
           </w:p>
         </w:tc>
@@ -5962,7 +5962,7 @@
                 <w:rFonts w:ascii="STSong" w:hAnsi="STSong" w:eastAsia="STSong"/>
                 <w:sz w:val="18"/>
               </w:rPr>
-              <w:t>src/predict_advanced.py</w:t>
+              <w:t>code/predict_advanced.py</w:t>
             </w:r>
           </w:p>
         </w:tc>
@@ -6410,7 +6410,7 @@
     </w:p>
     <w:p>
       <w:r>
-        <w:t>Reproduce with: python src/train.py --data data/fake_job_postings.csv --output outputs, then PYTHONPATH=src python src/train_advanced.py. The random seed is 42 and dependencies are recorded in requirements.txt.</w:t>
+        <w:t>Reproduce with: python code/train.py --data data/fake_job_postings.csv --output outputs, then PYTHONPATH=code python code/train_advanced.py. The random seed is 42 and dependencies are recorded in requirements.txt.</w:t>
       </w:r>
     </w:p>
     <w:sectPr>

</xml_diff>